<commit_message>
Avaliação com o gabarito (instruções revisadas) e anexo na nota técnica
Co-Authored-By: Claude Opus 5.5 <noreply@anthropic.com>
</commit_message>
<xml_diff>
--- a/docs/design_conversacional.docx
+++ b/docs/design_conversacional.docx
@@ -6480,7 +6480,33 @@
         <w:spacing w:after="60" w:line="290"/>
       </w:pPr>
       <w:r>
-        <w:t xml:space="preserve">Pendente: avaliação das respostas da IA com o gabarito (Ollama, ~1 h de processamento) e testes no celular e no balão.</w:t>
+        <w:t xml:space="preserve">Avaliação com o gabarito (Gemma 2 2B, 20/10/2026): citou o documento esperado em 20/23, 'não encontrei' indevido 1/23, fora do tema 5/7 pela IA e 6/7 com as regras da página — iguais à versão anterior das instruções. Detalhes na nota técnica (anexo).</w:t>
+      </w:r>
+    </w:p>
+    <w:p>
+      <w:pPr>
+        <w:pStyle w:val="ListParagraph"/>
+        <w:numPr>
+          <w:ilvl w:val="0"/>
+          <w:numId w:val="2"/>
+        </w:numPr>
+        <w:spacing w:after="60" w:line="290"/>
+      </w:pPr>
+      <w:r>
+        <w:t xml:space="preserve">Observação: as regras de atendimento encaminham ao SAC perguntas de custo ("quanto custa…"), inclusive as de pesquisa; isso evita números mal interpretados, mas pode ser revisto.</w:t>
+      </w:r>
+    </w:p>
+    <w:p>
+      <w:pPr>
+        <w:pStyle w:val="ListParagraph"/>
+        <w:numPr>
+          <w:ilvl w:val="0"/>
+          <w:numId w:val="2"/>
+        </w:numPr>
+        <w:spacing w:after="60" w:line="290"/>
+      </w:pPr>
+      <w:r>
+        <w:t xml:space="preserve">Pendente: testes no celular.</w:t>
       </w:r>
     </w:p>
     <w:sectPr>

</xml_diff>

<commit_message>
Registro das perguntas (desligado até haver a planilha), botões Ajudou/Não ajudou, CLAUDE.md e estado.md
Co-Authored-By: Claude Opus 5.5 <noreply@anthropic.com>
</commit_message>
<xml_diff>
--- a/docs/design_conversacional.docx
+++ b/docs/design_conversacional.docx
@@ -560,6 +560,28 @@
             <w:r>
               <w:fldChar w:fldCharType="begin" w:dirty="true"/>
               <w:instrText xml:space="preserve">PAGEREF _Toc19 \h</w:instrText>
+              <w:fldChar w:fldCharType="separate"/>
+              <w:fldChar w:fldCharType="end"/>
+            </w:r>
+          </w:hyperlink>
+        </w:p>
+        <w:p>
+          <w:pPr>
+            <w:pStyle w:val="TOC1"/>
+            <w:tabs>
+              <w:tab w:val="right" w:pos="9638" w:leader="dot"/>
+            </w:tabs>
+          </w:pPr>
+          <w:hyperlink w:history="1" w:anchor="_Toc20">
+            <w:r>
+              <w:t xml:space="preserve">12. Registro das perguntas (23/10/2026)</w:t>
+            </w:r>
+            <w:r>
+              <w:tab/>
+            </w:r>
+            <w:r>
+              <w:fldChar w:fldCharType="begin" w:dirty="true"/>
+              <w:instrText xml:space="preserve">PAGEREF _Toc20 \h</w:instrText>
               <w:fldChar w:fldCharType="separate"/>
               <w:fldChar w:fldCharType="end"/>
             </w:r>
@@ -6507,6 +6529,41 @@
       </w:pPr>
       <w:r>
         <w:t xml:space="preserve">Pendente: testes no celular.</w:t>
+      </w:r>
+    </w:p>
+    <w:p>
+      <w:pPr>
+        <w:pStyle w:val="Heading1"/>
+        <w:pageBreakBefore/>
+      </w:pPr>
+      <w:bookmarkStart w:name="_Toc20" w:id="20"/>
+      <w:r>
+        <w:t xml:space="preserve">12. Registro das perguntas (23/10/2026)</w:t>
+      </w:r>
+      <w:bookmarkEnd w:id="20"/>
+    </w:p>
+    <w:p>
+      <w:pPr>
+        <w:pStyle w:val="ListParagraph"/>
+        <w:numPr>
+          <w:ilvl w:val="0"/>
+          <w:numId w:val="2"/>
+        </w:numPr>
+        <w:spacing w:after="60" w:line="290"/>
+      </w:pPr>
+      <w:r>
+        <w:t xml:space="preserve">Só na página pública do GitHub; nunca no modo incorporado ao portal. Aviso sob a caixa de pergunta, botão "Não registrar as minhas", botões "Ajudou / Não ajudou" em cada resposta e texto de privacidade do Sobre ajustado automaticamente quando o registro está ligado. Detalhes, campos e instalação em </w:t>
+      </w:r>
+      <w:r>
+        <w:rPr>
+          <w:rFonts w:ascii="Consolas" w:cs="Consolas" w:eastAsia="Consolas" w:hAnsi="Consolas"/>
+          <w:sz w:val="19"/>
+          <w:szCs w:val="19"/>
+        </w:rPr>
+        <w:t xml:space="preserve">docs/REGISTRO.md</w:t>
+      </w:r>
+      <w:r>
+        <w:t xml:space="preserve">.</w:t>
       </w:r>
     </w:p>
     <w:sectPr>

</xml_diff>